<commit_message>
feat: add demo video, Most Ban card, and update presentation
- presentation/demo.mov: 시연 영상 추가
- presentation/final.html: 9페이지 영상 연결
- app/(tabs)/index.tsx: Most Ban TOP 1 카드 추가 (밴율 포함)
- presentation/script.md: Pull-to-Refresh → 실시간 자동 갱신 수정

Co-Authored-By: Claude Sonnet 4.6 <noreply@anthropic.com>
</commit_message>
<xml_diff>
--- a/presentation/script.docx
+++ b/presentation/script.docx
@@ -2,7 +2,7 @@
 <file path=word/document.xml><?xml version="1.0" encoding="utf-8"?>
 <w:document xmlns:w="http://schemas.openxmlformats.org/wordprocessingml/2006/main" xmlns:m="http://schemas.openxmlformats.org/officeDocument/2006/math" xmlns:r="http://schemas.openxmlformats.org/officeDocument/2006/relationships" xmlns:o="urn:schemas-microsoft-com:office:office" xmlns:v="urn:schemas-microsoft-com:vml" xmlns:w10="urn:schemas-microsoft-com:office:word" xmlns:a="http://schemas.openxmlformats.org/drawingml/2006/main" xmlns:pic="http://schemas.openxmlformats.org/drawingml/2006/picture" xmlns:wp="http://schemas.openxmlformats.org/drawingml/2006/wordprocessingDrawing">
   <w:body>
-    <w:bookmarkStart w:id="23" w:name="최종-발표-대본-puri.gg-mobile"/>
+    <w:bookmarkStart w:id="24" w:name="최종-발표-대본-puri.gg-mobile"/>
     <w:p>
       <w:pPr>
         <w:pStyle w:val="Heading1"/>
@@ -1251,7 +1251,96 @@
     </w:p>
     <w:bookmarkEnd w:id="20"/>
     <w:bookmarkEnd w:id="21"/>
-    <w:bookmarkStart w:id="22" w:name="시간-배분-요약"/>
+    <w:bookmarkStart w:id="22" w:name="ai-활용-언급-슬라이드-8-또는-11에서-삽입-추후-위치-결정"/>
+    <w:p>
+      <w:pPr>
+        <w:pStyle w:val="Heading2"/>
+      </w:pPr>
+      <w:r>
+        <w:t xml:space="preserve">🤖 AI 활용 언급 (슬라이드 8 또는 11에서 삽입 — 추후 위치 결정)</w:t>
+      </w:r>
+    </w:p>
+    <w:p>
+      <w:pPr>
+        <w:pStyle w:val="BlockText"/>
+      </w:pPr>
+      <w:r>
+        <w:t xml:space="preserve">✅ 가산점: AI Agent 활용 / 단일 md 통합 기법 / 암묵지 관리</w:t>
+      </w:r>
+    </w:p>
+    <w:p>
+      <w:pPr>
+        <w:pStyle w:val="FirstParagraph"/>
+      </w:pPr>
+      <w:r>
+        <w:t xml:space="preserve">이 프로젝트에서는</w:t>
+      </w:r>
+      <w:r>
+        <w:t xml:space="preserve"> </w:t>
+      </w:r>
+      <w:r>
+        <w:rPr>
+          <w:b/>
+          <w:bCs/>
+        </w:rPr>
+        <w:t xml:space="preserve">Claude Code AI Agent</w:t>
+      </w:r>
+      <w:r>
+        <w:t xml:space="preserve">를 적극적으로 활용했습니다.</w:t>
+      </w:r>
+    </w:p>
+    <w:p>
+      <w:pPr>
+        <w:pStyle w:val="BodyText"/>
+      </w:pPr>
+      <w:r>
+        <w:t xml:space="preserve">슬라이드 제작, 문서화, GitHub Actions 워크플로우 구성, 발표 대본 작성까지 AI와 함께 진행했고,</w:t>
+      </w:r>
+      <w:r>
+        <w:t xml:space="preserve"> </w:t>
+      </w:r>
+      <w:r>
+        <w:rPr>
+          <w:rStyle w:val="VerbatimChar"/>
+        </w:rPr>
+        <w:t xml:space="preserve">AGENTS.md</w:t>
+      </w:r>
+      <w:r>
+        <w:t xml:space="preserve"> </w:t>
+      </w:r>
+      <w:r>
+        <w:t xml:space="preserve">단일 파일에 프로젝트 컨텍스트·코드 규칙·명령어·설계 결정을 통합해 AI가 매 작업마다 일관된 결과를 낼 수 있도록 관리했습니다.</w:t>
+      </w:r>
+    </w:p>
+    <w:p>
+      <w:pPr>
+        <w:pStyle w:val="BodyText"/>
+      </w:pPr>
+      <w:r>
+        <w:t xml:space="preserve">또한</w:t>
+      </w:r>
+      <w:r>
+        <w:t xml:space="preserve"> </w:t>
+      </w:r>
+      <w:r>
+        <w:rPr>
+          <w:rStyle w:val="VerbatimChar"/>
+        </w:rPr>
+        <w:t xml:space="preserve">docs/LLM_WIKI.md</w:t>
+      </w:r>
+      <w:r>
+        <w:t xml:space="preserve">에 효과적인 프롬프트 패턴, AI의 한계와 직접 개입한 사례, 암묵지를 정리해 다음 프로젝트에서도 재활용할 수 있도록 했습니다.</w:t>
+      </w:r>
+    </w:p>
+    <w:p>
+      <w:r>
+        <w:pict>
+          <v:rect style="width:0;height:1.5pt" o:hralign="center" o:hrstd="t" o:hr="t"/>
+        </w:pict>
+      </w:r>
+    </w:p>
+    <w:bookmarkEnd w:id="22"/>
+    <w:bookmarkStart w:id="23" w:name="시간-배분-요약"/>
     <w:p>
       <w:pPr>
         <w:pStyle w:val="Heading2"/>
@@ -1735,8 +1824,8 @@
         </w:tc>
       </w:tr>
     </w:tbl>
-    <w:bookmarkEnd w:id="22"/>
     <w:bookmarkEnd w:id="23"/>
+    <w:bookmarkEnd w:id="24"/>
     <w:sectPr>
       <w:footnotePr>
         <w:numRestart w:val="eachSect"/>

</xml_diff>